<commit_message>
Uppdaterade kapitel och Angular
</commit_message>
<xml_diff>
--- a/Del 3 - Moderna Ramverk och Finalen/JavaScript-13 - Introduktion till React JS/JavaScript-13 - Introduktion till React JS.docx
+++ b/Del 3 - Moderna Ramverk och Finalen/JavaScript-13 - Introduktion till React JS/JavaScript-13 - Introduktion till React JS.docx
@@ -1727,22 +1727,33 @@
     </w:p>
     <w:p>
       <w:r>
-        <w:t>Hittills har vi byggt webbsidor genom att manuellt skapa HTML-element i JavaScript (document.createElement), ändra deras text (textContent) och trycka ut dem på sidan (appendChild). Det fungerar, men när en webbsida har hundratals rörliga delar blir det snabbt ett enormt pussel att hålla reda på.</w:t>
-      </w:r>
-    </w:p>
-    <w:p>
-      <w:r>
-        <w:t>Det är därför Facebook skapade React JS. React är ett bibliotek (eller ramverk) som gör det mycket enklare att bygga stora, interaktiva användargränssnitt.</w:t>
-      </w:r>
-    </w:p>
-    <w:p>
-      <w:r>
-        <w:t>I React skriver vi inte kod för hur webbläsaren ska ändra på HTML-elementen. Istället beskriver vi bara hur vi vill att sidan ska se ut baserat på vår data, och sedan sköter React resten automatiskt.</w:t>
-      </w:r>
-    </w:p>
-    <w:p>
-      <w:r>
-        <w:t>________________________________________</w:t>
+        <w:t>Hittills i kursen har vi byggt webbsidor genom att manuellt leta upp element (querySelector), skapa nya taggar (createElement), ändra text (textContent) och trycka ut dem på sidan (appendChild). Detta kallas för Imperativ programmering – vi dikterar exakt hur webbläsaren ska gå tillväga i varje litet steg.</w:t>
+      </w:r>
+    </w:p>
+    <w:p>
+      <w:r>
+        <w:t>När en webbapplikation växer och får hundratals rörliga delar (tänk dig Facebook-feeden med likes, kommentarer, chattfönster och aviseringar som uppdateras samtidigt) blir detta pussel snabbt ohanterligt. Det är lätt att missa att uppdatera ett element, vilket leder till dolda buggar.</w:t>
+      </w:r>
+    </w:p>
+    <w:p>
+      <w:r>
+        <w:t>För att lösa detta skapade Facebook React JS. React introducerar ett helt nytt tankesätt: Deklarativ programmering och Komponentbaserad arkitektur.</w:t>
+      </w:r>
+    </w:p>
+    <w:p>
+      <w:pPr>
+        <w:pStyle w:val="Underrubrik"/>
+        <w:rPr>
+          <w:color w:val="061F57"/>
+        </w:rPr>
+      </w:pPr>
+      <w:r>
+        <w:rPr>
+          <w:color w:val="061F57"/>
+        </w:rPr>
+        <w:pict w14:anchorId="7C0C1FC9">
+          <v:rect id="_x0000_i1025" style="width:0;height:1.5pt" o:hralign="center" o:hrstd="t" o:hr="t" fillcolor="#a0a0a0" stroked="f"/>
+        </w:pict>
       </w:r>
     </w:p>
     <w:p>
@@ -1750,110 +1761,83 @@
         <w:pStyle w:val="Rubrik2"/>
       </w:pPr>
       <w:r>
-        <w:t>Komponenter – Webbsidans Lego-bitar</w:t>
-      </w:r>
-    </w:p>
-    <w:p>
-      <w:r>
-        <w:t>I React delar vi upp webbsidan i små, självständiga och återanvändbara bitar som kallas Komponenter.</w:t>
-      </w:r>
-    </w:p>
-    <w:p>
-      <w:r>
-        <w:t>Istället för att ha en gigantisk HTML-fil med tusen rader kod, skapar vi en komponent för en knapp, en komponent för ett sökfält och en komponent för ett produktkort. Sedan pusslar vi ihop dem precis som Lego-bitar.</w:t>
-      </w:r>
-    </w:p>
-    <w:p>
-      <w:pPr>
-        <w:pStyle w:val="Kodstycke"/>
-      </w:pPr>
-      <w:r>
-        <w:t>┌─────────────────────────────────────────┐</w:t>
-      </w:r>
-    </w:p>
-    <w:p>
-      <w:pPr>
-        <w:pStyle w:val="Kodstycke"/>
-      </w:pPr>
-      <w:r>
-        <w:t>│          [ KOMPONENT: App ]             │</w:t>
-      </w:r>
-    </w:p>
-    <w:p>
-      <w:pPr>
-        <w:pStyle w:val="Kodstycke"/>
-      </w:pPr>
-      <w:r>
-        <w:t>│ ┌──────────────┐    ┌────────────────┐  │</w:t>
-      </w:r>
-    </w:p>
-    <w:p>
-      <w:pPr>
-        <w:pStyle w:val="Kodstycke"/>
-      </w:pPr>
-      <w:r>
-        <w:t>│ │  Sökfält     │    │  Kundvagn      │  │</w:t>
-      </w:r>
-    </w:p>
-    <w:p>
-      <w:pPr>
-        <w:pStyle w:val="Kodstycke"/>
-      </w:pPr>
-      <w:r>
-        <w:t>│ └──────────────┘    └────────────────┘  │</w:t>
-      </w:r>
-    </w:p>
-    <w:p>
-      <w:pPr>
-        <w:pStyle w:val="Kodstycke"/>
-      </w:pPr>
-      <w:r>
-        <w:t>│ ┌────────────────────────────────────┐  │</w:t>
-      </w:r>
-    </w:p>
-    <w:p>
-      <w:pPr>
-        <w:pStyle w:val="Kodstycke"/>
-      </w:pPr>
-      <w:r>
-        <w:t>│ │  Produktlista                      │  │</w:t>
-      </w:r>
-    </w:p>
-    <w:p>
-      <w:pPr>
-        <w:pStyle w:val="Kodstycke"/>
-      </w:pPr>
-      <w:r>
-        <w:t>│ │  [Kort]   [Kort]   [Kort]   [Kort] │  │</w:t>
-      </w:r>
-    </w:p>
-    <w:p>
-      <w:pPr>
-        <w:pStyle w:val="Kodstycke"/>
-      </w:pPr>
-      <w:r>
-        <w:t>│ └────────────────────────────────────┘  │</w:t>
-      </w:r>
-    </w:p>
-    <w:p>
-      <w:pPr>
-        <w:pStyle w:val="Kodstycke"/>
-      </w:pPr>
-      <w:r>
-        <w:t>└─────────────────────────────────────────┘</w:t>
-      </w:r>
-    </w:p>
-    <w:p>
-      <w:pPr>
-        <w:pStyle w:val="Bildtext"/>
-      </w:pPr>
-      <w:r>
-        <w:t>Bild 1 En React-applikation är uppbyggd av ett träd med komponenter som sitter inuti varandra.</w:t>
-      </w:r>
-    </w:p>
-    <w:p>
-      <w:r>
-        <w:t>________________________________________</w:t>
+        <w:t>Imperativ vs. Deklarativ kod</w:t>
+      </w:r>
+    </w:p>
+    <w:p>
+      <w:r>
+        <w:t>Skillnaden mellan hur vi har kodat tidigare och hur vi kodar i React kan sammanfattas så här:</w:t>
+      </w:r>
+    </w:p>
+    <w:p>
+      <w:pPr>
+        <w:numPr>
+          <w:ilvl w:val="0"/>
+          <w:numId w:val="25"/>
+        </w:numPr>
+      </w:pPr>
+      <w:r>
+        <w:rPr>
+          <w:b/>
+          <w:bCs/>
+        </w:rPr>
+        <w:t>Imperativt (Vanlig JS):</w:t>
+      </w:r>
+      <w:r>
+        <w:t xml:space="preserve"> Du ger datorn en detaljerad instruktionsmanual. </w:t>
+      </w:r>
+      <w:r>
+        <w:rPr>
+          <w:i/>
+          <w:iCs/>
+        </w:rPr>
+        <w:t>"Leta upp knappen, kontrollera om användaren är inloggad, om ja: ändra klassen till grön, skapa en p-tagg, lägg till texten..."</w:t>
+      </w:r>
+    </w:p>
+    <w:p>
+      <w:pPr>
+        <w:numPr>
+          <w:ilvl w:val="0"/>
+          <w:numId w:val="25"/>
+        </w:numPr>
+      </w:pPr>
+      <w:r>
+        <w:rPr>
+          <w:b/>
+          <w:bCs/>
+        </w:rPr>
+        <w:t>Deklarativt (React):</w:t>
+      </w:r>
+      <w:r>
+        <w:t xml:space="preserve"> Du beskriver bara slutresultatet baserat på din data. </w:t>
+      </w:r>
+      <w:r>
+        <w:rPr>
+          <w:i/>
+          <w:iCs/>
+        </w:rPr>
+        <w:t>"Om isLoggedIn är true, visa en grön knapp. Annars visa en grå knapp."</w:t>
+      </w:r>
+    </w:p>
+    <w:p>
+      <w:r>
+        <w:t>Du ändrar bara på din data, och React sköter automatiskt hela pusslet med att uppdatera skärmen åt dig.</w:t>
+      </w:r>
+    </w:p>
+    <w:p>
+      <w:pPr>
+        <w:pStyle w:val="Underrubrik"/>
+        <w:rPr>
+          <w:color w:val="061F57"/>
+        </w:rPr>
+      </w:pPr>
+      <w:r>
+        <w:rPr>
+          <w:color w:val="061F57"/>
+        </w:rPr>
+        <w:pict w14:anchorId="1ECED4C9">
+          <v:rect id="_x0000_i1026" style="width:0;height:1.5pt" o:hralign="center" o:hrstd="t" o:hr="t" fillcolor="#a0a0a0" stroked="f"/>
+        </w:pict>
       </w:r>
     </w:p>
     <w:p>
@@ -1861,149 +1845,27 @@
         <w:pStyle w:val="Rubrik2"/>
       </w:pPr>
       <w:r>
-        <w:t>JSX – HTML direkt i JavaScript</w:t>
-      </w:r>
-    </w:p>
-    <w:p>
-      <w:r>
-        <w:t>Det första man reagerar på när man ser React-kod är att det ser ut som en blandning av JavaScript och HTML. Detta kallas för JSX (JavaScript XML).</w:t>
-      </w:r>
-    </w:p>
-    <w:p>
-      <w:r>
-        <w:lastRenderedPageBreak/>
-        <w:t>JSX gör att vi kan skriva HTML-strukturen direkt inuti våra JavaScript-funktioner. Det är otroligt smidigt, eftersom vi slipper hålla på med innerHTML eller strängar.</w:t>
-      </w:r>
-    </w:p>
-    <w:p>
-      <w:r>
-        <w:t>Här är en enkel React-komponent. Lägg märke till att det bara är en helt vanlig JavaScript-funktion som returnerar något som ser ut som HTML</w:t>
-      </w:r>
-    </w:p>
-    <w:p>
-      <w:pPr>
-        <w:pStyle w:val="Kodstycke"/>
-      </w:pPr>
-      <w:r>
-        <w:t>// En enkel React-komponent (måste starta med STOR bokstav!)</w:t>
-      </w:r>
-    </w:p>
-    <w:p>
-      <w:pPr>
-        <w:pStyle w:val="Kodstycke"/>
-      </w:pPr>
-      <w:r>
-        <w:t>function VälkomstHälsning() {</w:t>
-      </w:r>
-    </w:p>
-    <w:p>
-      <w:pPr>
-        <w:pStyle w:val="Kodstycke"/>
-      </w:pPr>
-      <w:r>
-        <w:t xml:space="preserve">  const användarNamn = "Anna";</w:t>
-      </w:r>
-    </w:p>
-    <w:p>
-      <w:pPr>
-        <w:pStyle w:val="Kodstycke"/>
-      </w:pPr>
-    </w:p>
-    <w:p>
-      <w:pPr>
-        <w:pStyle w:val="Kodstycke"/>
-      </w:pPr>
-      <w:r>
-        <w:t xml:space="preserve">  return (</w:t>
-      </w:r>
-    </w:p>
-    <w:p>
-      <w:pPr>
-        <w:pStyle w:val="Kodstycke"/>
-      </w:pPr>
-      <w:r>
-        <w:t xml:space="preserve">    &lt;div className="halsning-box"&gt;</w:t>
-      </w:r>
-    </w:p>
-    <w:p>
-      <w:pPr>
-        <w:pStyle w:val="Kodstycke"/>
-      </w:pPr>
-      <w:r>
-        <w:t xml:space="preserve">      &lt;h1&gt;Välkommen tillbaka, {användarNamn}!&lt;/h1&gt;</w:t>
-      </w:r>
-    </w:p>
-    <w:p>
-      <w:pPr>
-        <w:pStyle w:val="Kodstycke"/>
-      </w:pPr>
-      <w:r>
-        <w:t xml:space="preserve">      &lt;p&gt;Idag är en bra dag att koda React.&lt;/p&gt;</w:t>
-      </w:r>
-    </w:p>
-    <w:p>
-      <w:pPr>
-        <w:pStyle w:val="Kodstycke"/>
-      </w:pPr>
-      <w:r>
-        <w:t xml:space="preserve">    &lt;/div&gt;</w:t>
-      </w:r>
-    </w:p>
-    <w:p>
-      <w:pPr>
-        <w:pStyle w:val="Kodstycke"/>
-      </w:pPr>
-      <w:r>
-        <w:t xml:space="preserve">  );</w:t>
-      </w:r>
-    </w:p>
-    <w:p>
-      <w:pPr>
-        <w:pStyle w:val="Kodstycke"/>
-      </w:pPr>
-      <w:r>
-        <w:t>}</w:t>
-      </w:r>
-    </w:p>
-    <w:p>
-      <w:pPr>
-        <w:pStyle w:val="Bildtext"/>
-      </w:pPr>
-      <w:r>
-        <w:t>Bild 2 Med måsvingar {} kan vi hoppa direkt från HTML-läge till JavaScript-läge.</w:t>
-      </w:r>
-    </w:p>
-    <w:p>
-      <w:r>
-        <w:t>________________________________________</w:t>
-      </w:r>
-    </w:p>
-    <w:p>
-      <w:pPr>
-        <w:pStyle w:val="Rubrik2"/>
-      </w:pPr>
-      <w:r>
-        <w:t>State (useState) – Komponentens minne</w:t>
-      </w:r>
-    </w:p>
-    <w:p>
-      <w:r>
-        <w:t>Komponenter är inte bara statiska Lego-bitar, de måste kunna ändra sig. Om en användare klickar på en knapp vill vi kanske att en siffra ska räknas upp, eller att en meny ska öppnas.</w:t>
-      </w:r>
-    </w:p>
-    <w:p>
-      <w:r>
-        <w:t>För att en komponent ska kunna komma ihåg saker använder vi något som kallas State (tillstånd). Vi skapar ett state med hjälp av en inbyggd React-funktion som heter useState.</w:t>
-      </w:r>
-    </w:p>
-    <w:p>
-      <w:r>
-        <w:t>När värdet i ett state ändras, fattar React det direkt och ritar om just den komponenten på skärmen blixtsnabbt.</w:t>
-      </w:r>
-    </w:p>
-    <w:p>
-      <w:r>
-        <w:t>Här är exakt samma funktionalitet som vi byggde med en tung Closure-funktion i Labb 08, fast skrivet på "React-sättet".</w:t>
+        <w:t>Virtual DOM – Hur React är så snabbt</w:t>
+      </w:r>
+    </w:p>
+    <w:p>
+      <w:r>
+        <w:t>Att ändra i den riktiga HTML-DOM:en är det absolut långsammaste en webbläsare kan göra. Om du ändrar ett litet element i en stor lista måste webbläsaren ofta räkna om layouten för hela sidan.</w:t>
+      </w:r>
+    </w:p>
+    <w:p>
+      <w:r>
+        <w:t xml:space="preserve">React löser detta genom att skapa en </w:t>
+      </w:r>
+      <w:r>
+        <w:rPr>
+          <w:b/>
+          <w:bCs/>
+        </w:rPr>
+        <w:t>Virtual DOM</w:t>
+      </w:r>
+      <w:r>
+        <w:t xml:space="preserve"> (en virtuell kopia av HTML-trädet som ligger lagrat i datorns snabba RAM-minne).</w:t>
       </w:r>
     </w:p>
     <w:p>
@@ -2027,6 +1889,458 @@
       </w:pPr>
       <w:r>
         <w:lastRenderedPageBreak/>
+        <w:t>STEP 1: [ Data ändras ] ───</w:t>
+      </w:r>
+      <w:r>
+        <w:rPr>
+          <w:rFonts w:ascii="Segoe UI Symbol" w:hAnsi="Segoe UI Symbol" w:cs="Segoe UI Symbol"/>
+        </w:rPr>
+        <w:t>➔</w:t>
+      </w:r>
+      <w:r>
+        <w:t xml:space="preserve"> [ Ny Virtual DOM skapas i minnet ]</w:t>
+      </w:r>
+    </w:p>
+    <w:p>
+      <w:pPr>
+        <w:pStyle w:val="Kodstycke"/>
+      </w:pPr>
+      <w:r>
+        <w:t xml:space="preserve">                                            │</w:t>
+      </w:r>
+    </w:p>
+    <w:p>
+      <w:pPr>
+        <w:pStyle w:val="Kodstycke"/>
+      </w:pPr>
+      <w:r>
+        <w:t xml:space="preserve">                                            ▼</w:t>
+      </w:r>
+    </w:p>
+    <w:p>
+      <w:pPr>
+        <w:pStyle w:val="Kodstycke"/>
+      </w:pPr>
+      <w:r>
+        <w:t xml:space="preserve"> STEP 2: [ Diffing-algoritm ] </w:t>
+      </w:r>
+      <w:r>
+        <w:rPr>
+          <w:rFonts w:ascii="Segoe UI Symbol" w:hAnsi="Segoe UI Symbol" w:cs="Segoe UI Symbol"/>
+        </w:rPr>
+        <w:t>➔</w:t>
+      </w:r>
+      <w:r>
+        <w:t xml:space="preserve"> J</w:t>
+      </w:r>
+      <w:r>
+        <w:rPr>
+          <w:rFonts w:ascii="Arial" w:hAnsi="Arial"/>
+        </w:rPr>
+        <w:t>ä</w:t>
+      </w:r>
+      <w:r>
+        <w:t>mf</w:t>
+      </w:r>
+      <w:r>
+        <w:rPr>
+          <w:rFonts w:ascii="Arial" w:hAnsi="Arial"/>
+        </w:rPr>
+        <w:t>ö</w:t>
+      </w:r>
+      <w:r>
+        <w:t>r den nya kopian med den gamla kopian</w:t>
+      </w:r>
+    </w:p>
+    <w:p>
+      <w:pPr>
+        <w:pStyle w:val="Kodstycke"/>
+      </w:pPr>
+      <w:r>
+        <w:t xml:space="preserve">                                            │</w:t>
+      </w:r>
+    </w:p>
+    <w:p>
+      <w:pPr>
+        <w:pStyle w:val="Kodstycke"/>
+      </w:pPr>
+      <w:r>
+        <w:t xml:space="preserve">                                            ▼</w:t>
+      </w:r>
+    </w:p>
+    <w:p>
+      <w:pPr>
+        <w:pStyle w:val="Kodstycke"/>
+      </w:pPr>
+      <w:r>
+        <w:t xml:space="preserve"> STEP 3: [ Avstämd uppdatering ] </w:t>
+      </w:r>
+      <w:r>
+        <w:rPr>
+          <w:rFonts w:ascii="Segoe UI Symbol" w:hAnsi="Segoe UI Symbol" w:cs="Segoe UI Symbol"/>
+        </w:rPr>
+        <w:t>➔</w:t>
+      </w:r>
+      <w:r>
+        <w:t xml:space="preserve"> Blixtsnabb </w:t>
+      </w:r>
+      <w:r>
+        <w:rPr>
+          <w:rFonts w:ascii="Arial" w:hAnsi="Arial"/>
+        </w:rPr>
+        <w:t>ä</w:t>
+      </w:r>
+      <w:r>
+        <w:t>ndring av ENBART det som skiljer sig i den riktiga DOM:en!</w:t>
+      </w:r>
+    </w:p>
+    <w:p>
+      <w:pPr>
+        <w:pStyle w:val="Bildtext"/>
+      </w:pPr>
+      <w:r>
+        <w:t>Bild 1: Istället för att rita om hela sidan, räknar React ut exakt vilken minsta lilla punkt som har ändrats och uppdaterar enbart den i webbläsaren.</w:t>
+      </w:r>
+    </w:p>
+    <w:p>
+      <w:pPr>
+        <w:pStyle w:val="Underrubrik"/>
+        <w:rPr>
+          <w:color w:val="061F57"/>
+        </w:rPr>
+      </w:pPr>
+      <w:r>
+        <w:rPr>
+          <w:color w:val="061F57"/>
+        </w:rPr>
+        <w:pict w14:anchorId="27DAB08F">
+          <v:rect id="_x0000_i1027" style="width:0;height:1.5pt" o:hralign="center" o:hrstd="t" o:hr="t" fillcolor="#a0a0a0" stroked="f"/>
+        </w:pict>
+      </w:r>
+    </w:p>
+    <w:p>
+      <w:pPr>
+        <w:pStyle w:val="Rubrik2"/>
+      </w:pPr>
+      <w:r>
+        <w:t>Komponenter – Webbsidans Lego-bitar</w:t>
+      </w:r>
+    </w:p>
+    <w:p>
+      <w:r>
+        <w:t>I React delar vi upp webbsidan i små, självständiga och återanvändbara bitar som kallas Komponenter.</w:t>
+      </w:r>
+      <w:r>
+        <w:t xml:space="preserve"> </w:t>
+      </w:r>
+      <w:r>
+        <w:t xml:space="preserve">En komponent är i grunden en helt vanlig JavaScript-funktion som returnerar hur en del av skärmen ska se ut. </w:t>
+      </w:r>
+      <w:r>
+        <w:t>Man</w:t>
+      </w:r>
+      <w:r>
+        <w:t xml:space="preserve"> skapa</w:t>
+      </w:r>
+      <w:r>
+        <w:t>r</w:t>
+      </w:r>
+      <w:r>
+        <w:t xml:space="preserve"> en komponent för ett sökfält, en för menyrad och en för produktkort, och sedan pussla</w:t>
+      </w:r>
+      <w:r>
+        <w:t>r</w:t>
+      </w:r>
+      <w:r>
+        <w:t xml:space="preserve"> ihop dem.</w:t>
+      </w:r>
+    </w:p>
+    <w:p>
+      <w:pPr>
+        <w:pStyle w:val="Kodstycke"/>
+      </w:pPr>
+      <w:r>
+        <w:t>┌─────────────────────────────────────────┐</w:t>
+      </w:r>
+    </w:p>
+    <w:p>
+      <w:pPr>
+        <w:pStyle w:val="Kodstycke"/>
+      </w:pPr>
+      <w:r>
+        <w:t>│          [ KOMPONENT: App ]             │</w:t>
+      </w:r>
+    </w:p>
+    <w:p>
+      <w:pPr>
+        <w:pStyle w:val="Kodstycke"/>
+      </w:pPr>
+      <w:r>
+        <w:t>│ ┌──────────────┐    ┌────────────────┐  │</w:t>
+      </w:r>
+    </w:p>
+    <w:p>
+      <w:pPr>
+        <w:pStyle w:val="Kodstycke"/>
+      </w:pPr>
+      <w:r>
+        <w:t>│ │  Sökfält     │    │  Kundvagn      │  │</w:t>
+      </w:r>
+    </w:p>
+    <w:p>
+      <w:pPr>
+        <w:pStyle w:val="Kodstycke"/>
+      </w:pPr>
+      <w:r>
+        <w:t>│ └──────────────┘    └────────────────┘  │</w:t>
+      </w:r>
+    </w:p>
+    <w:p>
+      <w:pPr>
+        <w:pStyle w:val="Kodstycke"/>
+      </w:pPr>
+      <w:r>
+        <w:t>│ ┌────────────────────────────────────┐  │</w:t>
+      </w:r>
+    </w:p>
+    <w:p>
+      <w:pPr>
+        <w:pStyle w:val="Kodstycke"/>
+      </w:pPr>
+      <w:r>
+        <w:t>│ │  Produktlista                      │  │</w:t>
+      </w:r>
+    </w:p>
+    <w:p>
+      <w:pPr>
+        <w:pStyle w:val="Kodstycke"/>
+      </w:pPr>
+      <w:r>
+        <w:t>│ │  [Kort]   [Kort]   [Kort]   [Kort] │  │</w:t>
+      </w:r>
+    </w:p>
+    <w:p>
+      <w:pPr>
+        <w:pStyle w:val="Kodstycke"/>
+      </w:pPr>
+      <w:r>
+        <w:t>│ └────────────────────────────────────┘  │</w:t>
+      </w:r>
+    </w:p>
+    <w:p>
+      <w:pPr>
+        <w:pStyle w:val="Kodstycke"/>
+      </w:pPr>
+      <w:r>
+        <w:t>└─────────────────────────────────────────┘</w:t>
+      </w:r>
+    </w:p>
+    <w:p>
+      <w:pPr>
+        <w:pStyle w:val="Bildtext"/>
+      </w:pPr>
+      <w:r>
+        <w:t>Bild 1 En React-applikation är uppbyggd av ett träd med komponenter som sitter inuti varandra.</w:t>
+      </w:r>
+    </w:p>
+    <w:p>
+      <w:pPr>
+        <w:pStyle w:val="Underrubrik"/>
+        <w:rPr>
+          <w:color w:val="061F57"/>
+        </w:rPr>
+      </w:pPr>
+      <w:r>
+        <w:rPr>
+          <w:color w:val="061F57"/>
+        </w:rPr>
+        <w:pict w14:anchorId="168EAE74">
+          <v:rect id="_x0000_i1028" style="width:0;height:1.5pt" o:hralign="center" o:hrstd="t" o:hr="t" fillcolor="#a0a0a0" stroked="f"/>
+        </w:pict>
+      </w:r>
+    </w:p>
+    <w:p>
+      <w:pPr>
+        <w:pStyle w:val="Rubrik2"/>
+      </w:pPr>
+      <w:r>
+        <w:t>JSX – HTML direkt i JavaScript</w:t>
+      </w:r>
+    </w:p>
+    <w:p>
+      <w:r>
+        <w:t>Det första man reagerar på när man ser React-kod är att det ser ut som en blandning av JavaScript och HTML. Detta kallas för JSX (JavaScript XML).</w:t>
+      </w:r>
+    </w:p>
+    <w:p>
+      <w:r>
+        <w:t>JSX gör att vi kan skriva HTML-strukturen direkt inuti våra JavaScript-funktioner. Det är otroligt smidigt, eftersom vi slipper hålla på med innerHTML eller strängar.</w:t>
+      </w:r>
+    </w:p>
+    <w:p>
+      <w:r>
+        <w:t>Här är en enkel React-komponent. Lägg märke till att det bara är en helt vanlig JavaScript-funktion som returnerar något som ser ut som HTML</w:t>
+      </w:r>
+    </w:p>
+    <w:p>
+      <w:pPr>
+        <w:pStyle w:val="Kodstycke"/>
+      </w:pPr>
+      <w:r>
+        <w:lastRenderedPageBreak/>
+        <w:t>// En enkel React-komponent (måste starta med STOR bokstav!)</w:t>
+      </w:r>
+    </w:p>
+    <w:p>
+      <w:pPr>
+        <w:pStyle w:val="Kodstycke"/>
+      </w:pPr>
+      <w:r>
+        <w:t>function VälkomstHälsning() {</w:t>
+      </w:r>
+    </w:p>
+    <w:p>
+      <w:pPr>
+        <w:pStyle w:val="Kodstycke"/>
+      </w:pPr>
+      <w:r>
+        <w:t xml:space="preserve">  const användarNamn = "Anna";</w:t>
+      </w:r>
+    </w:p>
+    <w:p>
+      <w:pPr>
+        <w:pStyle w:val="Kodstycke"/>
+      </w:pPr>
+    </w:p>
+    <w:p>
+      <w:pPr>
+        <w:pStyle w:val="Kodstycke"/>
+      </w:pPr>
+      <w:r>
+        <w:t xml:space="preserve">  return (</w:t>
+      </w:r>
+    </w:p>
+    <w:p>
+      <w:pPr>
+        <w:pStyle w:val="Kodstycke"/>
+      </w:pPr>
+      <w:r>
+        <w:t xml:space="preserve">    &lt;div className="halsning-box"&gt;</w:t>
+      </w:r>
+    </w:p>
+    <w:p>
+      <w:pPr>
+        <w:pStyle w:val="Kodstycke"/>
+      </w:pPr>
+      <w:r>
+        <w:t xml:space="preserve">      &lt;h1&gt;Välkommen tillbaka, {användarNamn}!&lt;/h1&gt;</w:t>
+      </w:r>
+    </w:p>
+    <w:p>
+      <w:pPr>
+        <w:pStyle w:val="Kodstycke"/>
+      </w:pPr>
+      <w:r>
+        <w:t xml:space="preserve">      &lt;p&gt;Idag är en bra dag att koda React.&lt;/p&gt;</w:t>
+      </w:r>
+    </w:p>
+    <w:p>
+      <w:pPr>
+        <w:pStyle w:val="Kodstycke"/>
+      </w:pPr>
+      <w:r>
+        <w:t xml:space="preserve">    &lt;/div&gt;</w:t>
+      </w:r>
+    </w:p>
+    <w:p>
+      <w:pPr>
+        <w:pStyle w:val="Kodstycke"/>
+      </w:pPr>
+      <w:r>
+        <w:t xml:space="preserve">  );</w:t>
+      </w:r>
+    </w:p>
+    <w:p>
+      <w:pPr>
+        <w:pStyle w:val="Kodstycke"/>
+      </w:pPr>
+      <w:r>
+        <w:t>}</w:t>
+      </w:r>
+    </w:p>
+    <w:p>
+      <w:pPr>
+        <w:pStyle w:val="Bildtext"/>
+      </w:pPr>
+      <w:r>
+        <w:t>Bild 2 Med måsvingar {} kan vi hoppa direkt från HTML-läge till JavaScript-läge.</w:t>
+      </w:r>
+    </w:p>
+    <w:p>
+      <w:pPr>
+        <w:pStyle w:val="Underrubrik"/>
+        <w:rPr>
+          <w:color w:val="061F57"/>
+        </w:rPr>
+      </w:pPr>
+      <w:r>
+        <w:rPr>
+          <w:color w:val="061F57"/>
+        </w:rPr>
+        <w:pict w14:anchorId="4B8FD3DA">
+          <v:rect id="_x0000_i1029" style="width:0;height:1.5pt" o:hralign="center" o:hrstd="t" o:hr="t" fillcolor="#a0a0a0" stroked="f"/>
+        </w:pict>
+      </w:r>
+    </w:p>
+    <w:p>
+      <w:pPr>
+        <w:pStyle w:val="Rubrik2"/>
+      </w:pPr>
+      <w:r>
+        <w:t>State (useState) – Komponentens minne</w:t>
+      </w:r>
+    </w:p>
+    <w:p>
+      <w:r>
+        <w:t>Komponenter är inte bara statiska Lego-bitar, de måste kunna ändra sig. Om en användare klickar på en knapp vill vi kanske att en siffra ska räknas upp, eller att en meny ska öppnas.</w:t>
+      </w:r>
+    </w:p>
+    <w:p>
+      <w:r>
+        <w:t>För att en komponent ska kunna komma ihåg saker använder vi något som kallas State (tillstånd). Vi skapar ett state med hjälp av en inbyggd React-funktion som heter useState.</w:t>
+      </w:r>
+    </w:p>
+    <w:p>
+      <w:r>
+        <w:t>När värdet i ett state ändras, fattar React det direkt och ritar om just den komponenten på skärmen blixtsnabbt.</w:t>
+      </w:r>
+    </w:p>
+    <w:p>
+      <w:r>
+        <w:t>Här är exakt samma funktionalitet som vi byggde med en tung Closure-funktion i Labb 08, fast skrivet på "React-sättet".</w:t>
+      </w:r>
+    </w:p>
+    <w:p>
+      <w:pPr>
+        <w:spacing w:after="160" w:line="278" w:lineRule="auto"/>
+        <w:ind w:left="0" w:firstLine="0"/>
+        <w:rPr>
+          <w:rFonts w:ascii="Consolas" w:hAnsi="Consolas"/>
+          <w:color w:val="156082" w:themeColor="accent1"/>
+          <w:sz w:val="20"/>
+          <w:szCs w:val="20"/>
+        </w:rPr>
+      </w:pPr>
+      <w:r>
+        <w:br w:type="page"/>
+      </w:r>
+    </w:p>
+    <w:p>
+      <w:pPr>
+        <w:pStyle w:val="Kodstycke"/>
+      </w:pPr>
+      <w:r>
+        <w:lastRenderedPageBreak/>
         <w:t>import { useState } from 'react';</w:t>
       </w:r>
     </w:p>
@@ -2174,8 +2488,19 @@
       </w:r>
     </w:p>
     <w:p>
-      <w:r>
-        <w:t>________________________________________</w:t>
+      <w:pPr>
+        <w:pStyle w:val="Underrubrik"/>
+        <w:rPr>
+          <w:color w:val="061F57"/>
+        </w:rPr>
+      </w:pPr>
+      <w:r>
+        <w:rPr>
+          <w:color w:val="061F57"/>
+        </w:rPr>
+        <w:pict w14:anchorId="2EEEC594">
+          <v:rect id="_x0000_i1030" style="width:0;height:1.5pt" o:hralign="center" o:hrstd="t" o:hr="t" fillcolor="#a0a0a0" stroked="f"/>
+        </w:pict>
       </w:r>
     </w:p>
     <w:p>
@@ -2399,14 +2724,7 @@
                 <w:rFonts w:ascii="Segoe UI Emoji" w:hAnsi="Segoe UI Emoji" w:cs="Segoe UI Emoji"/>
                 <w:color w:val="EE0000"/>
               </w:rPr>
-              <w:t>⚠️</w:t>
-            </w:r>
-            <w:r>
-              <w:rPr>
-                <w:rFonts w:ascii="Segoe UI Emoji" w:hAnsi="Segoe UI Emoji" w:cs="Segoe UI Emoji"/>
-                <w:color w:val="EE0000"/>
-              </w:rPr>
-              <w:t xml:space="preserve"> </w:t>
+              <w:t xml:space="preserve">⚠️ </w:t>
             </w:r>
             <w:r>
               <w:rPr>
@@ -2437,101 +2755,56 @@
     <w:p>
       <w:pPr>
         <w:pStyle w:val="Rubrik3"/>
-        <w:rPr>
-          <w:lang w:val="en-SE"/>
-        </w:rPr>
-      </w:pPr>
-      <w:r>
-        <w:rPr>
-          <w:lang w:val="en-SE"/>
-        </w:rPr>
+      </w:pPr>
+      <w:r>
         <w:t xml:space="preserve">Så fungerar det i </w:t>
       </w:r>
       <w:r>
-        <w:rPr>
-          <w:lang w:val="en-SE"/>
-        </w:rPr>
         <w:t>verkligheten</w:t>
       </w:r>
     </w:p>
     <w:p>
-      <w:pPr>
-        <w:rPr>
-          <w:lang w:val="en-SE"/>
-        </w:rPr>
-      </w:pPr>
-      <w:r>
-        <w:rPr>
-          <w:lang w:val="en-SE"/>
-        </w:rPr>
+      <w:r>
         <w:t>Tänk dig att du är en lärare och har en klass med 20 elever. Du ska dela ut veckobrev.</w:t>
       </w:r>
     </w:p>
     <w:p>
-      <w:pPr>
-        <w:rPr>
-          <w:lang w:val="en-SE"/>
-        </w:rPr>
-      </w:pPr>
-      <w:r>
-        <w:rPr>
-          <w:lang w:val="en-SE"/>
-        </w:rPr>
+      <w:r>
         <w:t xml:space="preserve">Om alla elever har likadana tröjor och saknar namnlappar, blir det jättesvårt för dig att veta vem som är vem på långt håll. Om elev nummer 5 byter plats med elev </w:t>
       </w:r>
       <w:r>
-        <w:rPr>
-          <w:lang w:val="en-SE"/>
-        </w:rPr>
         <w:lastRenderedPageBreak/>
         <w:t>nummer 12, måste du gå fram och titta noga på varje person för att räkna ut vem som flyttade på sig. Det tar tid och energi.</w:t>
       </w:r>
     </w:p>
     <w:p>
-      <w:pPr>
-        <w:rPr>
-          <w:lang w:val="en-SE"/>
-        </w:rPr>
-      </w:pPr>
-      <w:r>
-        <w:rPr>
-          <w:lang w:val="en-SE"/>
-        </w:rPr>
+      <w:r>
         <w:t xml:space="preserve">Men om varje elev har en </w:t>
       </w:r>
       <w:r>
         <w:rPr>
           <w:b/>
           <w:bCs/>
-          <w:lang w:val="en-SE"/>
         </w:rPr>
         <w:t>unik</w:t>
       </w:r>
       <w:r>
-        <w:rPr>
-          <w:lang w:val="en-SE"/>
-        </w:rPr>
         <w:t xml:space="preserve"> namnlapp på bröstet (en </w:t>
       </w:r>
       <w:r>
         <w:rPr>
           <w:b/>
           <w:bCs/>
-          <w:lang w:val="en-SE"/>
         </w:rPr>
         <w:t>key</w:t>
       </w:r>
       <w:r>
-        <w:rPr>
-          <w:lang w:val="en-SE"/>
-        </w:rPr>
         <w:t xml:space="preserve">), ser du direkt: </w:t>
       </w:r>
       <w:r>
         <w:rPr>
           <w:i/>
           <w:iCs/>
-          <w:lang w:val="en-SE"/>
         </w:rPr>
         <w:t>"Aha, det var Johan som flyttade dit, och Sara som gick ut ur rummet."</w:t>
       </w:r>
@@ -2539,14 +2812,8 @@
     <w:p>
       <w:pPr>
         <w:pStyle w:val="Rubrik3"/>
-        <w:rPr>
-          <w:lang w:val="en-SE"/>
-        </w:rPr>
-      </w:pPr>
-      <w:r>
-        <w:rPr>
-          <w:lang w:val="en-SE"/>
-        </w:rPr>
+      </w:pPr>
+      <w:r>
         <w:t>Så fungerar det i React:</w:t>
       </w:r>
     </w:p>
@@ -2556,22 +2823,15 @@
           <w:ilvl w:val="0"/>
           <w:numId w:val="22"/>
         </w:numPr>
-        <w:rPr>
-          <w:lang w:val="en-SE"/>
-        </w:rPr>
       </w:pPr>
       <w:r>
         <w:rPr>
           <w:b/>
           <w:bCs/>
-          <w:lang w:val="en-SE"/>
         </w:rPr>
         <w:t>Loopen</w:t>
       </w:r>
       <w:r>
-        <w:rPr>
-          <w:lang w:val="en-SE"/>
-        </w:rPr>
         <w:t xml:space="preserve"> är klassrummet med alla elever (t.ex. en lista med produkter i en varukorg).</w:t>
       </w:r>
     </w:p>
@@ -2581,22 +2841,15 @@
           <w:ilvl w:val="0"/>
           <w:numId w:val="22"/>
         </w:numPr>
-        <w:rPr>
-          <w:lang w:val="en-SE"/>
-        </w:rPr>
       </w:pPr>
       <w:r>
         <w:rPr>
           <w:b/>
           <w:bCs/>
-          <w:lang w:val="en-SE"/>
         </w:rPr>
         <w:t>Varje element</w:t>
       </w:r>
       <w:r>
-        <w:rPr>
-          <w:lang w:val="en-SE"/>
-        </w:rPr>
         <w:t xml:space="preserve"> är en enskild elev (en produkt).</w:t>
       </w:r>
     </w:p>
@@ -2606,76 +2859,43 @@
           <w:ilvl w:val="0"/>
           <w:numId w:val="22"/>
         </w:numPr>
-        <w:rPr>
-          <w:lang w:val="en-SE"/>
-        </w:rPr>
       </w:pPr>
       <w:r>
         <w:rPr>
           <w:b/>
           <w:bCs/>
-          <w:lang w:val="en-SE"/>
         </w:rPr>
         <w:t>key-egenskapen</w:t>
       </w:r>
       <w:r>
-        <w:rPr>
-          <w:lang w:val="en-SE"/>
-        </w:rPr>
         <w:t xml:space="preserve"> är namnlappen.</w:t>
       </w:r>
     </w:p>
     <w:p>
-      <w:pPr>
-        <w:rPr>
-          <w:lang w:val="en-SE"/>
-        </w:rPr>
-      </w:pPr>
-      <w:r>
-        <w:rPr>
-          <w:lang w:val="en-SE"/>
-        </w:rPr>
+      <w:r>
         <w:t xml:space="preserve">När något ändras i din lista – till exempel att du tar bort en produkt eller ändrar ordning på dem – tittar React på namnlapparna (key). Tack vare dem slipper React läsa igenom och bygga om hela listan från början. Den uppdaterar </w:t>
       </w:r>
       <w:r>
         <w:rPr>
           <w:b/>
           <w:bCs/>
-          <w:lang w:val="en-SE"/>
         </w:rPr>
         <w:t>bara just den saken</w:t>
       </w:r>
       <w:r>
-        <w:rPr>
-          <w:lang w:val="en-SE"/>
-        </w:rPr>
         <w:t xml:space="preserve"> som ändrades.</w:t>
       </w:r>
     </w:p>
     <w:p>
-      <w:pPr>
-        <w:rPr>
-          <w:lang w:val="en-SE"/>
-        </w:rPr>
-      </w:pPr>
-      <w:r>
-        <w:rPr>
-          <w:lang w:val="en-SE"/>
-        </w:rPr>
+      <w:r>
         <w:t>Det gör att hemsidan laddar mycket snabbare och inte gör onödigt arbete!</w:t>
       </w:r>
     </w:p>
     <w:p>
       <w:pPr>
         <w:pStyle w:val="Rubrik3"/>
-        <w:rPr>
-          <w:lang w:val="en-SE"/>
-        </w:rPr>
-      </w:pPr>
-      <w:r>
-        <w:rPr>
-          <w:lang w:val="en-SE"/>
-        </w:rPr>
+      </w:pPr>
+      <w:r>
         <w:t>Förklaring av kodexemplet</w:t>
       </w:r>
     </w:p>
@@ -2685,22 +2905,15 @@
           <w:ilvl w:val="0"/>
           <w:numId w:val="23"/>
         </w:numPr>
-        <w:rPr>
-          <w:lang w:val="en-SE"/>
-        </w:rPr>
       </w:pPr>
       <w:r>
         <w:rPr>
           <w:b/>
           <w:bCs/>
-          <w:lang w:val="en-SE"/>
         </w:rPr>
         <w:t>key={vara.id}</w:t>
       </w:r>
       <w:r>
-        <w:rPr>
-          <w:lang w:val="en-SE"/>
-        </w:rPr>
         <w:t>: Detta är själva namnlappen. För Mjölk blir key 101, för Bröd blir den 102, och så vidare.</w:t>
       </w:r>
     </w:p>
@@ -2710,22 +2923,15 @@
           <w:ilvl w:val="0"/>
           <w:numId w:val="23"/>
         </w:numPr>
-        <w:rPr>
-          <w:lang w:val="en-SE"/>
-        </w:rPr>
       </w:pPr>
       <w:r>
         <w:rPr>
           <w:b/>
           <w:bCs/>
-          <w:lang w:val="en-SE"/>
         </w:rPr>
         <w:t>Varför står det inte i webbläsaren?</w:t>
       </w:r>
       <w:r>
-        <w:rPr>
-          <w:lang w:val="en-SE"/>
-        </w:rPr>
         <w:t xml:space="preserve"> Namnlappen är bara till för Reacts interna system. Den syns inte för personen som besöker hemsidan.</w:t>
       </w:r>
     </w:p>
@@ -2735,32 +2941,35 @@
           <w:ilvl w:val="0"/>
           <w:numId w:val="23"/>
         </w:numPr>
-        <w:rPr>
-          <w:lang w:val="en-SE"/>
-        </w:rPr>
       </w:pPr>
       <w:r>
         <w:rPr>
           <w:b/>
           <w:bCs/>
-          <w:lang w:val="en-SE"/>
         </w:rPr>
         <w:t>Vad händer om vi tar bort "Bröd"?</w:t>
       </w:r>
       <w:r>
+        <w:t xml:space="preserve"> React kollar på listan, ser att namnlapp 102 är borta, och plockar blixtsnabbt bort just det elementet från skärmen. Den rör inte Mjölk (101) eller Kaffe (103).</w:t>
+      </w:r>
+    </w:p>
+    <w:p>
+      <w:pPr>
+        <w:pStyle w:val="Underrubrik"/>
         <w:rPr>
-          <w:lang w:val="en-SE"/>
+          <w:color w:val="061F57"/>
         </w:rPr>
-        <w:t xml:space="preserve"> React kollar på listan, ser att namnlapp 102 är borta, och plockar blixtsnabbt bort just det elementet från skärmen. Den rör inte Mjölk (101) eller Kaffe (103).</w:t>
-      </w:r>
-    </w:p>
-    <w:p>
-      <w:pPr>
+      </w:pPr>
+      <w:r>
         <w:rPr>
-          <w:lang w:val="en-SE"/>
+          <w:color w:val="061F57"/>
         </w:rPr>
-      </w:pPr>
-    </w:p>
+        <w:pict w14:anchorId="5D607A68">
+          <v:rect id="_x0000_i1034" style="width:0;height:1.5pt" o:hralign="center" o:hrstd="t" o:hr="t" fillcolor="#a0a0a0" stroked="f"/>
+        </w:pict>
+      </w:r>
+    </w:p>
+    <w:p/>
     <w:sectPr>
       <w:headerReference w:type="even" r:id="rId12"/>
       <w:headerReference w:type="default" r:id="rId13"/>
@@ -3244,7 +3453,7 @@
         <w:ind w:left="720" w:hanging="360"/>
       </w:pPr>
     </w:lvl>
-    <w:lvl w:ilvl="1" w:tentative="1">
+    <w:lvl w:ilvl="1">
       <w:start w:val="1"/>
       <w:numFmt w:val="decimal"/>
       <w:lvlText w:val="%2."/>
@@ -4277,6 +4486,155 @@
     </w:lvl>
   </w:abstractNum>
   <w:abstractNum w:abstractNumId="8" w15:restartNumberingAfterBreak="0">
+    <w:nsid w:val="451E417F"/>
+    <w:multiLevelType w:val="multilevel"/>
+    <w:tmpl w:val="C7B293B6"/>
+    <w:lvl w:ilvl="0">
+      <w:start w:val="1"/>
+      <w:numFmt w:val="bullet"/>
+      <w:lvlText w:val=""/>
+      <w:lvlJc w:val="left"/>
+      <w:pPr>
+        <w:tabs>
+          <w:tab w:val="num" w:pos="720"/>
+        </w:tabs>
+        <w:ind w:left="720" w:hanging="360"/>
+      </w:pPr>
+      <w:rPr>
+        <w:rFonts w:ascii="Symbol" w:hAnsi="Symbol" w:hint="default"/>
+        <w:sz w:val="20"/>
+      </w:rPr>
+    </w:lvl>
+    <w:lvl w:ilvl="1" w:tentative="1">
+      <w:start w:val="1"/>
+      <w:numFmt w:val="bullet"/>
+      <w:lvlText w:val="o"/>
+      <w:lvlJc w:val="left"/>
+      <w:pPr>
+        <w:tabs>
+          <w:tab w:val="num" w:pos="1440"/>
+        </w:tabs>
+        <w:ind w:left="1440" w:hanging="360"/>
+      </w:pPr>
+      <w:rPr>
+        <w:rFonts w:ascii="Courier New" w:hAnsi="Courier New" w:hint="default"/>
+        <w:sz w:val="20"/>
+      </w:rPr>
+    </w:lvl>
+    <w:lvl w:ilvl="2" w:tentative="1">
+      <w:start w:val="1"/>
+      <w:numFmt w:val="bullet"/>
+      <w:lvlText w:val=""/>
+      <w:lvlJc w:val="left"/>
+      <w:pPr>
+        <w:tabs>
+          <w:tab w:val="num" w:pos="2160"/>
+        </w:tabs>
+        <w:ind w:left="2160" w:hanging="360"/>
+      </w:pPr>
+      <w:rPr>
+        <w:rFonts w:ascii="Wingdings" w:hAnsi="Wingdings" w:hint="default"/>
+        <w:sz w:val="20"/>
+      </w:rPr>
+    </w:lvl>
+    <w:lvl w:ilvl="3" w:tentative="1">
+      <w:start w:val="1"/>
+      <w:numFmt w:val="bullet"/>
+      <w:lvlText w:val=""/>
+      <w:lvlJc w:val="left"/>
+      <w:pPr>
+        <w:tabs>
+          <w:tab w:val="num" w:pos="2880"/>
+        </w:tabs>
+        <w:ind w:left="2880" w:hanging="360"/>
+      </w:pPr>
+      <w:rPr>
+        <w:rFonts w:ascii="Wingdings" w:hAnsi="Wingdings" w:hint="default"/>
+        <w:sz w:val="20"/>
+      </w:rPr>
+    </w:lvl>
+    <w:lvl w:ilvl="4" w:tentative="1">
+      <w:start w:val="1"/>
+      <w:numFmt w:val="bullet"/>
+      <w:lvlText w:val=""/>
+      <w:lvlJc w:val="left"/>
+      <w:pPr>
+        <w:tabs>
+          <w:tab w:val="num" w:pos="3600"/>
+        </w:tabs>
+        <w:ind w:left="3600" w:hanging="360"/>
+      </w:pPr>
+      <w:rPr>
+        <w:rFonts w:ascii="Wingdings" w:hAnsi="Wingdings" w:hint="default"/>
+        <w:sz w:val="20"/>
+      </w:rPr>
+    </w:lvl>
+    <w:lvl w:ilvl="5" w:tentative="1">
+      <w:start w:val="1"/>
+      <w:numFmt w:val="bullet"/>
+      <w:lvlText w:val=""/>
+      <w:lvlJc w:val="left"/>
+      <w:pPr>
+        <w:tabs>
+          <w:tab w:val="num" w:pos="4320"/>
+        </w:tabs>
+        <w:ind w:left="4320" w:hanging="360"/>
+      </w:pPr>
+      <w:rPr>
+        <w:rFonts w:ascii="Wingdings" w:hAnsi="Wingdings" w:hint="default"/>
+        <w:sz w:val="20"/>
+      </w:rPr>
+    </w:lvl>
+    <w:lvl w:ilvl="6" w:tentative="1">
+      <w:start w:val="1"/>
+      <w:numFmt w:val="bullet"/>
+      <w:lvlText w:val=""/>
+      <w:lvlJc w:val="left"/>
+      <w:pPr>
+        <w:tabs>
+          <w:tab w:val="num" w:pos="5040"/>
+        </w:tabs>
+        <w:ind w:left="5040" w:hanging="360"/>
+      </w:pPr>
+      <w:rPr>
+        <w:rFonts w:ascii="Wingdings" w:hAnsi="Wingdings" w:hint="default"/>
+        <w:sz w:val="20"/>
+      </w:rPr>
+    </w:lvl>
+    <w:lvl w:ilvl="7" w:tentative="1">
+      <w:start w:val="1"/>
+      <w:numFmt w:val="bullet"/>
+      <w:lvlText w:val=""/>
+      <w:lvlJc w:val="left"/>
+      <w:pPr>
+        <w:tabs>
+          <w:tab w:val="num" w:pos="5760"/>
+        </w:tabs>
+        <w:ind w:left="5760" w:hanging="360"/>
+      </w:pPr>
+      <w:rPr>
+        <w:rFonts w:ascii="Wingdings" w:hAnsi="Wingdings" w:hint="default"/>
+        <w:sz w:val="20"/>
+      </w:rPr>
+    </w:lvl>
+    <w:lvl w:ilvl="8" w:tentative="1">
+      <w:start w:val="1"/>
+      <w:numFmt w:val="bullet"/>
+      <w:lvlText w:val=""/>
+      <w:lvlJc w:val="left"/>
+      <w:pPr>
+        <w:tabs>
+          <w:tab w:val="num" w:pos="6480"/>
+        </w:tabs>
+        <w:ind w:left="6480" w:hanging="360"/>
+      </w:pPr>
+      <w:rPr>
+        <w:rFonts w:ascii="Wingdings" w:hAnsi="Wingdings" w:hint="default"/>
+        <w:sz w:val="20"/>
+      </w:rPr>
+    </w:lvl>
+  </w:abstractNum>
+  <w:abstractNum w:abstractNumId="9" w15:restartNumberingAfterBreak="0">
     <w:nsid w:val="49FE6C65"/>
     <w:multiLevelType w:val="multilevel"/>
     <w:tmpl w:val="7F708A02"/>
@@ -4425,7 +4783,156 @@
       </w:rPr>
     </w:lvl>
   </w:abstractNum>
-  <w:abstractNum w:abstractNumId="9" w15:restartNumberingAfterBreak="0">
+  <w:abstractNum w:abstractNumId="10" w15:restartNumberingAfterBreak="0">
+    <w:nsid w:val="506275D5"/>
+    <w:multiLevelType w:val="multilevel"/>
+    <w:tmpl w:val="F62242DC"/>
+    <w:lvl w:ilvl="0">
+      <w:start w:val="1"/>
+      <w:numFmt w:val="bullet"/>
+      <w:lvlText w:val=""/>
+      <w:lvlJc w:val="left"/>
+      <w:pPr>
+        <w:tabs>
+          <w:tab w:val="num" w:pos="720"/>
+        </w:tabs>
+        <w:ind w:left="720" w:hanging="360"/>
+      </w:pPr>
+      <w:rPr>
+        <w:rFonts w:ascii="Symbol" w:hAnsi="Symbol" w:hint="default"/>
+        <w:sz w:val="20"/>
+      </w:rPr>
+    </w:lvl>
+    <w:lvl w:ilvl="1" w:tentative="1">
+      <w:start w:val="1"/>
+      <w:numFmt w:val="bullet"/>
+      <w:lvlText w:val="o"/>
+      <w:lvlJc w:val="left"/>
+      <w:pPr>
+        <w:tabs>
+          <w:tab w:val="num" w:pos="1440"/>
+        </w:tabs>
+        <w:ind w:left="1440" w:hanging="360"/>
+      </w:pPr>
+      <w:rPr>
+        <w:rFonts w:ascii="Courier New" w:hAnsi="Courier New" w:hint="default"/>
+        <w:sz w:val="20"/>
+      </w:rPr>
+    </w:lvl>
+    <w:lvl w:ilvl="2" w:tentative="1">
+      <w:start w:val="1"/>
+      <w:numFmt w:val="bullet"/>
+      <w:lvlText w:val=""/>
+      <w:lvlJc w:val="left"/>
+      <w:pPr>
+        <w:tabs>
+          <w:tab w:val="num" w:pos="2160"/>
+        </w:tabs>
+        <w:ind w:left="2160" w:hanging="360"/>
+      </w:pPr>
+      <w:rPr>
+        <w:rFonts w:ascii="Wingdings" w:hAnsi="Wingdings" w:hint="default"/>
+        <w:sz w:val="20"/>
+      </w:rPr>
+    </w:lvl>
+    <w:lvl w:ilvl="3" w:tentative="1">
+      <w:start w:val="1"/>
+      <w:numFmt w:val="bullet"/>
+      <w:lvlText w:val=""/>
+      <w:lvlJc w:val="left"/>
+      <w:pPr>
+        <w:tabs>
+          <w:tab w:val="num" w:pos="2880"/>
+        </w:tabs>
+        <w:ind w:left="2880" w:hanging="360"/>
+      </w:pPr>
+      <w:rPr>
+        <w:rFonts w:ascii="Wingdings" w:hAnsi="Wingdings" w:hint="default"/>
+        <w:sz w:val="20"/>
+      </w:rPr>
+    </w:lvl>
+    <w:lvl w:ilvl="4" w:tentative="1">
+      <w:start w:val="1"/>
+      <w:numFmt w:val="bullet"/>
+      <w:lvlText w:val=""/>
+      <w:lvlJc w:val="left"/>
+      <w:pPr>
+        <w:tabs>
+          <w:tab w:val="num" w:pos="3600"/>
+        </w:tabs>
+        <w:ind w:left="3600" w:hanging="360"/>
+      </w:pPr>
+      <w:rPr>
+        <w:rFonts w:ascii="Wingdings" w:hAnsi="Wingdings" w:hint="default"/>
+        <w:sz w:val="20"/>
+      </w:rPr>
+    </w:lvl>
+    <w:lvl w:ilvl="5" w:tentative="1">
+      <w:start w:val="1"/>
+      <w:numFmt w:val="bullet"/>
+      <w:lvlText w:val=""/>
+      <w:lvlJc w:val="left"/>
+      <w:pPr>
+        <w:tabs>
+          <w:tab w:val="num" w:pos="4320"/>
+        </w:tabs>
+        <w:ind w:left="4320" w:hanging="360"/>
+      </w:pPr>
+      <w:rPr>
+        <w:rFonts w:ascii="Wingdings" w:hAnsi="Wingdings" w:hint="default"/>
+        <w:sz w:val="20"/>
+      </w:rPr>
+    </w:lvl>
+    <w:lvl w:ilvl="6" w:tentative="1">
+      <w:start w:val="1"/>
+      <w:numFmt w:val="bullet"/>
+      <w:lvlText w:val=""/>
+      <w:lvlJc w:val="left"/>
+      <w:pPr>
+        <w:tabs>
+          <w:tab w:val="num" w:pos="5040"/>
+        </w:tabs>
+        <w:ind w:left="5040" w:hanging="360"/>
+      </w:pPr>
+      <w:rPr>
+        <w:rFonts w:ascii="Wingdings" w:hAnsi="Wingdings" w:hint="default"/>
+        <w:sz w:val="20"/>
+      </w:rPr>
+    </w:lvl>
+    <w:lvl w:ilvl="7" w:tentative="1">
+      <w:start w:val="1"/>
+      <w:numFmt w:val="bullet"/>
+      <w:lvlText w:val=""/>
+      <w:lvlJc w:val="left"/>
+      <w:pPr>
+        <w:tabs>
+          <w:tab w:val="num" w:pos="5760"/>
+        </w:tabs>
+        <w:ind w:left="5760" w:hanging="360"/>
+      </w:pPr>
+      <w:rPr>
+        <w:rFonts w:ascii="Wingdings" w:hAnsi="Wingdings" w:hint="default"/>
+        <w:sz w:val="20"/>
+      </w:rPr>
+    </w:lvl>
+    <w:lvl w:ilvl="8" w:tentative="1">
+      <w:start w:val="1"/>
+      <w:numFmt w:val="bullet"/>
+      <w:lvlText w:val=""/>
+      <w:lvlJc w:val="left"/>
+      <w:pPr>
+        <w:tabs>
+          <w:tab w:val="num" w:pos="6480"/>
+        </w:tabs>
+        <w:ind w:left="6480" w:hanging="360"/>
+      </w:pPr>
+      <w:rPr>
+        <w:rFonts w:ascii="Wingdings" w:hAnsi="Wingdings" w:hint="default"/>
+        <w:sz w:val="20"/>
+      </w:rPr>
+    </w:lvl>
+  </w:abstractNum>
+  <w:abstractNum w:abstractNumId="11" w15:restartNumberingAfterBreak="0">
     <w:nsid w:val="537A2F67"/>
     <w:multiLevelType w:val="multilevel"/>
     <w:tmpl w:val="67FCC784"/>
@@ -4574,7 +5081,7 @@
       </w:rPr>
     </w:lvl>
   </w:abstractNum>
-  <w:abstractNum w:abstractNumId="10" w15:restartNumberingAfterBreak="0">
+  <w:abstractNum w:abstractNumId="12" w15:restartNumberingAfterBreak="0">
     <w:nsid w:val="58A15727"/>
     <w:multiLevelType w:val="multilevel"/>
     <w:tmpl w:val="98F69174"/>
@@ -4687,7 +5194,7 @@
       </w:pPr>
     </w:lvl>
   </w:abstractNum>
-  <w:abstractNum w:abstractNumId="11" w15:restartNumberingAfterBreak="0">
+  <w:abstractNum w:abstractNumId="13" w15:restartNumberingAfterBreak="0">
     <w:nsid w:val="61182BD6"/>
     <w:multiLevelType w:val="hybridMultilevel"/>
     <w:tmpl w:val="C972D428"/>
@@ -4800,7 +5307,7 @@
       </w:rPr>
     </w:lvl>
   </w:abstractNum>
-  <w:abstractNum w:abstractNumId="12" w15:restartNumberingAfterBreak="0">
+  <w:abstractNum w:abstractNumId="14" w15:restartNumberingAfterBreak="0">
     <w:nsid w:val="611C4B47"/>
     <w:multiLevelType w:val="multilevel"/>
     <w:tmpl w:val="5330AEA4"/>
@@ -4913,7 +5420,7 @@
       </w:pPr>
     </w:lvl>
   </w:abstractNum>
-  <w:abstractNum w:abstractNumId="13" w15:restartNumberingAfterBreak="0">
+  <w:abstractNum w:abstractNumId="15" w15:restartNumberingAfterBreak="0">
     <w:nsid w:val="65B227C4"/>
     <w:multiLevelType w:val="hybridMultilevel"/>
     <w:tmpl w:val="7A58087A"/>
@@ -5026,7 +5533,7 @@
       </w:rPr>
     </w:lvl>
   </w:abstractNum>
-  <w:abstractNum w:abstractNumId="14" w15:restartNumberingAfterBreak="0">
+  <w:abstractNum w:abstractNumId="16" w15:restartNumberingAfterBreak="0">
     <w:nsid w:val="68570F60"/>
     <w:multiLevelType w:val="hybridMultilevel"/>
     <w:tmpl w:val="456EE7C6"/>
@@ -5115,7 +5622,7 @@
       </w:pPr>
     </w:lvl>
   </w:abstractNum>
-  <w:abstractNum w:abstractNumId="15" w15:restartNumberingAfterBreak="0">
+  <w:abstractNum w:abstractNumId="17" w15:restartNumberingAfterBreak="0">
     <w:nsid w:val="6936197C"/>
     <w:multiLevelType w:val="hybridMultilevel"/>
     <w:tmpl w:val="DF207A44"/>
@@ -5201,7 +5708,7 @@
       </w:pPr>
     </w:lvl>
   </w:abstractNum>
-  <w:abstractNum w:abstractNumId="16" w15:restartNumberingAfterBreak="0">
+  <w:abstractNum w:abstractNumId="18" w15:restartNumberingAfterBreak="0">
     <w:nsid w:val="6CFF3CC9"/>
     <w:multiLevelType w:val="multilevel"/>
     <w:tmpl w:val="686A33F6"/>
@@ -5314,7 +5821,7 @@
       </w:pPr>
     </w:lvl>
   </w:abstractNum>
-  <w:abstractNum w:abstractNumId="17" w15:restartNumberingAfterBreak="0">
+  <w:abstractNum w:abstractNumId="19" w15:restartNumberingAfterBreak="0">
     <w:nsid w:val="6D5060B5"/>
     <w:multiLevelType w:val="hybridMultilevel"/>
     <w:tmpl w:val="77C2EAFE"/>
@@ -5403,7 +5910,7 @@
       </w:pPr>
     </w:lvl>
   </w:abstractNum>
-  <w:abstractNum w:abstractNumId="18" w15:restartNumberingAfterBreak="0">
+  <w:abstractNum w:abstractNumId="20" w15:restartNumberingAfterBreak="0">
     <w:nsid w:val="6EB320FA"/>
     <w:multiLevelType w:val="multilevel"/>
     <w:tmpl w:val="983E1B9E"/>
@@ -5552,7 +6059,7 @@
       </w:rPr>
     </w:lvl>
   </w:abstractNum>
-  <w:abstractNum w:abstractNumId="19" w15:restartNumberingAfterBreak="0">
+  <w:abstractNum w:abstractNumId="21" w15:restartNumberingAfterBreak="0">
     <w:nsid w:val="6F4F09EA"/>
     <w:multiLevelType w:val="hybridMultilevel"/>
     <w:tmpl w:val="2E943A16"/>
@@ -5641,7 +6148,7 @@
       </w:pPr>
     </w:lvl>
   </w:abstractNum>
-  <w:abstractNum w:abstractNumId="20" w15:restartNumberingAfterBreak="0">
+  <w:abstractNum w:abstractNumId="22" w15:restartNumberingAfterBreak="0">
     <w:nsid w:val="70036924"/>
     <w:multiLevelType w:val="multilevel"/>
     <w:tmpl w:val="C8307142"/>
@@ -5754,7 +6261,7 @@
       </w:pPr>
     </w:lvl>
   </w:abstractNum>
-  <w:abstractNum w:abstractNumId="21" w15:restartNumberingAfterBreak="0">
+  <w:abstractNum w:abstractNumId="23" w15:restartNumberingAfterBreak="0">
     <w:nsid w:val="763777CB"/>
     <w:multiLevelType w:val="multilevel"/>
     <w:tmpl w:val="DD2C950A"/>
@@ -5903,7 +6410,7 @@
       </w:rPr>
     </w:lvl>
   </w:abstractNum>
-  <w:abstractNum w:abstractNumId="22" w15:restartNumberingAfterBreak="0">
+  <w:abstractNum w:abstractNumId="24" w15:restartNumberingAfterBreak="0">
     <w:nsid w:val="773E67AF"/>
     <w:multiLevelType w:val="hybridMultilevel"/>
     <w:tmpl w:val="B0F082CC"/>
@@ -6017,13 +6524,13 @@
     </w:lvl>
   </w:abstractNum>
   <w:num w:numId="1" w16cid:durableId="928807389">
-    <w:abstractNumId w:val="14"/>
+    <w:abstractNumId w:val="16"/>
   </w:num>
   <w:num w:numId="2" w16cid:durableId="225381545">
-    <w:abstractNumId w:val="17"/>
+    <w:abstractNumId w:val="19"/>
   </w:num>
   <w:num w:numId="3" w16cid:durableId="972254287">
-    <w:abstractNumId w:val="19"/>
+    <w:abstractNumId w:val="21"/>
   </w:num>
   <w:num w:numId="4" w16cid:durableId="1980718377">
     <w:abstractNumId w:val="5"/>
@@ -6035,46 +6542,46 @@
     <w:abstractNumId w:val="1"/>
   </w:num>
   <w:num w:numId="7" w16cid:durableId="555943606">
-    <w:abstractNumId w:val="12"/>
+    <w:abstractNumId w:val="14"/>
   </w:num>
   <w:num w:numId="8" w16cid:durableId="1945068039">
-    <w:abstractNumId w:val="15"/>
+    <w:abstractNumId w:val="17"/>
   </w:num>
   <w:num w:numId="9" w16cid:durableId="1650356061">
     <w:abstractNumId w:val="4"/>
   </w:num>
   <w:num w:numId="10" w16cid:durableId="2058889347">
-    <w:abstractNumId w:val="13"/>
+    <w:abstractNumId w:val="15"/>
   </w:num>
   <w:num w:numId="11" w16cid:durableId="1239902538">
-    <w:abstractNumId w:val="10"/>
+    <w:abstractNumId w:val="12"/>
   </w:num>
   <w:num w:numId="12" w16cid:durableId="1943806250">
-    <w:abstractNumId w:val="16"/>
+    <w:abstractNumId w:val="18"/>
   </w:num>
   <w:num w:numId="13" w16cid:durableId="872304685">
-    <w:abstractNumId w:val="20"/>
+    <w:abstractNumId w:val="22"/>
   </w:num>
   <w:num w:numId="14" w16cid:durableId="2019624065">
     <w:abstractNumId w:val="3"/>
   </w:num>
   <w:num w:numId="15" w16cid:durableId="120155749">
+    <w:abstractNumId w:val="13"/>
+  </w:num>
+  <w:num w:numId="16" w16cid:durableId="1627270058">
+    <w:abstractNumId w:val="24"/>
+  </w:num>
+  <w:num w:numId="17" w16cid:durableId="469447801">
+    <w:abstractNumId w:val="23"/>
+  </w:num>
+  <w:num w:numId="18" w16cid:durableId="1610120101">
     <w:abstractNumId w:val="11"/>
   </w:num>
-  <w:num w:numId="16" w16cid:durableId="1627270058">
-    <w:abstractNumId w:val="22"/>
-  </w:num>
-  <w:num w:numId="17" w16cid:durableId="469447801">
-    <w:abstractNumId w:val="21"/>
-  </w:num>
-  <w:num w:numId="18" w16cid:durableId="1610120101">
+  <w:num w:numId="19" w16cid:durableId="1809475097">
     <w:abstractNumId w:val="9"/>
   </w:num>
-  <w:num w:numId="19" w16cid:durableId="1809475097">
-    <w:abstractNumId w:val="8"/>
-  </w:num>
   <w:num w:numId="20" w16cid:durableId="1946182502">
-    <w:abstractNumId w:val="18"/>
+    <w:abstractNumId w:val="20"/>
   </w:num>
   <w:num w:numId="21" w16cid:durableId="1484544100">
     <w:abstractNumId w:val="6"/>
@@ -6084,6 +6591,12 @@
   </w:num>
   <w:num w:numId="23" w16cid:durableId="806972656">
     <w:abstractNumId w:val="0"/>
+  </w:num>
+  <w:num w:numId="24" w16cid:durableId="697006414">
+    <w:abstractNumId w:val="8"/>
+  </w:num>
+  <w:num w:numId="25" w16cid:durableId="904797038">
+    <w:abstractNumId w:val="10"/>
   </w:num>
 </w:numbering>
 </file>
@@ -6559,6 +7072,7 @@
   <w:style w:type="character" w:default="1" w:styleId="Standardstycketeckensnitt">
     <w:name w:val="Default Paragraph Font"/>
     <w:uiPriority w:val="1"/>
+    <w:semiHidden/>
     <w:unhideWhenUsed/>
   </w:style>
   <w:style w:type="table" w:default="1" w:styleId="Normaltabell">

</xml_diff>